<commit_message>
project name updated appending IncreaseAvailableQuantity to shopping-Cart
</commit_message>
<xml_diff>
--- a/docs/increaseAvailableQuantity-Req-Analisys-Design.docx
+++ b/docs/increaseAvailableQuantity-Req-Analisys-Design.docx
@@ -810,66 +810,6 @@
         <w:spacing w:after="0" w:line="240" w:lineRule="auto"/>
         <w:jc w:val="center"/>
         <w:rPr>
-          <w:sz w:val="20"/>
-          <w:szCs w:val="20"/>
-        </w:rPr>
-      </w:pPr>
-    </w:p>
-    <w:p>
-      <w:pPr>
-        <w:spacing w:after="0" w:line="240" w:lineRule="auto"/>
-        <w:jc w:val="center"/>
-        <w:rPr>
-          <w:sz w:val="20"/>
-          <w:szCs w:val="20"/>
-        </w:rPr>
-      </w:pPr>
-    </w:p>
-    <w:p>
-      <w:pPr>
-        <w:spacing w:after="0" w:line="240" w:lineRule="auto"/>
-        <w:jc w:val="center"/>
-        <w:rPr>
-          <w:sz w:val="20"/>
-          <w:szCs w:val="20"/>
-        </w:rPr>
-      </w:pPr>
-    </w:p>
-    <w:p>
-      <w:pPr>
-        <w:spacing w:after="0" w:line="240" w:lineRule="auto"/>
-        <w:jc w:val="center"/>
-        <w:rPr>
-          <w:sz w:val="20"/>
-          <w:szCs w:val="20"/>
-        </w:rPr>
-      </w:pPr>
-    </w:p>
-    <w:p>
-      <w:pPr>
-        <w:spacing w:after="0" w:line="240" w:lineRule="auto"/>
-        <w:jc w:val="center"/>
-        <w:rPr>
-          <w:sz w:val="20"/>
-          <w:szCs w:val="20"/>
-        </w:rPr>
-      </w:pPr>
-    </w:p>
-    <w:p>
-      <w:pPr>
-        <w:spacing w:after="0" w:line="240" w:lineRule="auto"/>
-        <w:jc w:val="center"/>
-        <w:rPr>
-          <w:sz w:val="20"/>
-          <w:szCs w:val="20"/>
-        </w:rPr>
-      </w:pPr>
-    </w:p>
-    <w:p>
-      <w:pPr>
-        <w:spacing w:after="0" w:line="240" w:lineRule="auto"/>
-        <w:jc w:val="center"/>
-        <w:rPr>
           <w:color w:val="0F4761"/>
           <w:sz w:val="20"/>
           <w:szCs w:val="20"/>
@@ -1290,11 +1230,201 @@
     </w:p>
     <w:p>
       <w:pPr>
+        <w:numPr>
+          <w:ilvl w:val="0"/>
+          <w:numId w:val="4"/>
+        </w:numPr>
+        <w:pBdr>
+          <w:top w:val="nil"/>
+          <w:left w:val="nil"/>
+          <w:bottom w:val="nil"/>
+          <w:right w:val="nil"/>
+          <w:between w:val="nil"/>
+        </w:pBdr>
         <w:spacing w:after="0"/>
         <w:rPr>
-          <w:sz w:val="20"/>
-          <w:szCs w:val="20"/>
-          <w:lang w:val="en-US"/>
+          <w:b/>
+          <w:bCs/>
+          <w:i/>
+          <w:iCs/>
+          <w:color w:val="0F4761"/>
+          <w:sz w:val="20"/>
+          <w:szCs w:val="20"/>
+        </w:rPr>
+      </w:pPr>
+      <w:r>
+        <w:rPr>
+          <w:b/>
+          <w:bCs/>
+          <w:i/>
+          <w:iCs/>
+          <w:color w:val="0F4761"/>
+          <w:sz w:val="20"/>
+          <w:szCs w:val="20"/>
+        </w:rPr>
+        <w:t>Pre y Post condiciones</w:t>
+      </w:r>
+    </w:p>
+    <w:p>
+      <w:pPr>
+        <w:spacing w:after="0"/>
+        <w:rPr>
+          <w:sz w:val="20"/>
+          <w:szCs w:val="20"/>
+        </w:rPr>
+      </w:pPr>
+    </w:p>
+    <w:p>
+      <w:pPr>
+        <w:spacing w:after="0"/>
+        <w:rPr>
+          <w:sz w:val="20"/>
+          <w:szCs w:val="20"/>
+        </w:rPr>
+      </w:pPr>
+      <w:proofErr w:type="spellStart"/>
+      <w:r>
+        <w:rPr>
+          <w:sz w:val="20"/>
+          <w:szCs w:val="20"/>
+        </w:rPr>
+        <w:t>Pre-condiciones</w:t>
+      </w:r>
+      <w:proofErr w:type="spellEnd"/>
+    </w:p>
+    <w:p>
+      <w:pPr>
+        <w:pStyle w:val="ListParagraph"/>
+        <w:numPr>
+          <w:ilvl w:val="0"/>
+          <w:numId w:val="19"/>
+        </w:numPr>
+        <w:spacing w:after="0"/>
+        <w:rPr>
+          <w:sz w:val="20"/>
+          <w:szCs w:val="20"/>
+        </w:rPr>
+      </w:pPr>
+      <w:r>
+        <w:rPr>
+          <w:sz w:val="20"/>
+          <w:szCs w:val="20"/>
+        </w:rPr>
+        <w:t>Existe un ca</w:t>
+      </w:r>
+      <w:r>
+        <w:rPr>
+          <w:sz w:val="20"/>
+          <w:szCs w:val="20"/>
+        </w:rPr>
+        <w:t>tálogo</w:t>
+      </w:r>
+    </w:p>
+    <w:p>
+      <w:pPr>
+        <w:pStyle w:val="ListParagraph"/>
+        <w:numPr>
+          <w:ilvl w:val="0"/>
+          <w:numId w:val="19"/>
+        </w:numPr>
+        <w:spacing w:after="0"/>
+        <w:rPr>
+          <w:sz w:val="20"/>
+          <w:szCs w:val="20"/>
+        </w:rPr>
+      </w:pPr>
+      <w:r>
+        <w:rPr>
+          <w:sz w:val="20"/>
+          <w:szCs w:val="20"/>
+        </w:rPr>
+        <w:t>Existe e</w:t>
+      </w:r>
+      <w:r>
+        <w:rPr>
+          <w:sz w:val="20"/>
+          <w:szCs w:val="20"/>
+        </w:rPr>
+        <w:t xml:space="preserve">l </w:t>
+      </w:r>
+      <w:r>
+        <w:rPr>
+          <w:sz w:val="20"/>
+          <w:szCs w:val="20"/>
+        </w:rPr>
+        <w:t xml:space="preserve">producto al que se le va a aumentar la disponibilidad. </w:t>
+      </w:r>
+    </w:p>
+    <w:p>
+      <w:pPr>
+        <w:spacing w:after="0"/>
+        <w:rPr>
+          <w:sz w:val="20"/>
+          <w:szCs w:val="20"/>
+        </w:rPr>
+      </w:pPr>
+    </w:p>
+    <w:p>
+      <w:pPr>
+        <w:spacing w:after="0"/>
+        <w:rPr>
+          <w:sz w:val="20"/>
+          <w:szCs w:val="20"/>
+        </w:rPr>
+      </w:pPr>
+      <w:proofErr w:type="spellStart"/>
+      <w:proofErr w:type="gramStart"/>
+      <w:r>
+        <w:rPr>
+          <w:sz w:val="20"/>
+          <w:szCs w:val="20"/>
+        </w:rPr>
+        <w:t>Post-condiciones</w:t>
+      </w:r>
+      <w:proofErr w:type="spellEnd"/>
+      <w:proofErr w:type="gramEnd"/>
+    </w:p>
+    <w:p>
+      <w:pPr>
+        <w:pStyle w:val="ListParagraph"/>
+        <w:numPr>
+          <w:ilvl w:val="0"/>
+          <w:numId w:val="19"/>
+        </w:numPr>
+        <w:spacing w:after="0"/>
+        <w:rPr>
+          <w:sz w:val="20"/>
+          <w:szCs w:val="20"/>
+        </w:rPr>
+      </w:pPr>
+      <w:r>
+        <w:rPr>
+          <w:sz w:val="20"/>
+          <w:szCs w:val="20"/>
+        </w:rPr>
+        <w:t xml:space="preserve">El </w:t>
+      </w:r>
+      <w:r>
+        <w:rPr>
+          <w:sz w:val="20"/>
+          <w:szCs w:val="20"/>
+        </w:rPr>
+        <w:t>producto tiene la cantidad anterior más uno.</w:t>
+      </w:r>
+      <w:r>
+        <w:rPr>
+          <w:sz w:val="20"/>
+          <w:szCs w:val="20"/>
+        </w:rPr>
+        <w:t xml:space="preserve"> </w:t>
+      </w:r>
+    </w:p>
+    <w:p>
+      <w:pPr>
+        <w:spacing w:after="0"/>
+        <w:rPr>
+          <w:sz w:val="20"/>
+          <w:szCs w:val="20"/>
         </w:rPr>
       </w:pPr>
     </w:p>
@@ -7018,6 +7148,119 @@
     </w:lvl>
   </w:abstractNum>
   <w:abstractNum w:abstractNumId="6" w15:restartNumberingAfterBreak="0">
+    <w:nsid w:val="2FAA3E90"/>
+    <w:multiLevelType w:val="hybridMultilevel"/>
+    <w:tmpl w:val="D2DE4B8E"/>
+    <w:lvl w:ilvl="0" w:tplc="04FEC564">
+      <w:start w:val="1"/>
+      <w:numFmt w:val="bullet"/>
+      <w:lvlText w:val=""/>
+      <w:lvlJc w:val="left"/>
+      <w:pPr>
+        <w:ind w:left="720" w:hanging="360"/>
+      </w:pPr>
+      <w:rPr>
+        <w:rFonts w:ascii="Symbol" w:hAnsi="Symbol" w:hint="default"/>
+      </w:rPr>
+    </w:lvl>
+    <w:lvl w:ilvl="1" w:tplc="04090003" w:tentative="1">
+      <w:start w:val="1"/>
+      <w:numFmt w:val="bullet"/>
+      <w:lvlText w:val="o"/>
+      <w:lvlJc w:val="left"/>
+      <w:pPr>
+        <w:ind w:left="1440" w:hanging="360"/>
+      </w:pPr>
+      <w:rPr>
+        <w:rFonts w:ascii="Courier New" w:hAnsi="Courier New" w:cs="Courier New" w:hint="default"/>
+      </w:rPr>
+    </w:lvl>
+    <w:lvl w:ilvl="2" w:tplc="04090005" w:tentative="1">
+      <w:start w:val="1"/>
+      <w:numFmt w:val="bullet"/>
+      <w:lvlText w:val=""/>
+      <w:lvlJc w:val="left"/>
+      <w:pPr>
+        <w:ind w:left="2160" w:hanging="360"/>
+      </w:pPr>
+      <w:rPr>
+        <w:rFonts w:ascii="Wingdings" w:hAnsi="Wingdings" w:hint="default"/>
+      </w:rPr>
+    </w:lvl>
+    <w:lvl w:ilvl="3" w:tplc="04090001" w:tentative="1">
+      <w:start w:val="1"/>
+      <w:numFmt w:val="bullet"/>
+      <w:lvlText w:val=""/>
+      <w:lvlJc w:val="left"/>
+      <w:pPr>
+        <w:ind w:left="2880" w:hanging="360"/>
+      </w:pPr>
+      <w:rPr>
+        <w:rFonts w:ascii="Symbol" w:hAnsi="Symbol" w:hint="default"/>
+      </w:rPr>
+    </w:lvl>
+    <w:lvl w:ilvl="4" w:tplc="04090003" w:tentative="1">
+      <w:start w:val="1"/>
+      <w:numFmt w:val="bullet"/>
+      <w:lvlText w:val="o"/>
+      <w:lvlJc w:val="left"/>
+      <w:pPr>
+        <w:ind w:left="3600" w:hanging="360"/>
+      </w:pPr>
+      <w:rPr>
+        <w:rFonts w:ascii="Courier New" w:hAnsi="Courier New" w:cs="Courier New" w:hint="default"/>
+      </w:rPr>
+    </w:lvl>
+    <w:lvl w:ilvl="5" w:tplc="04090005" w:tentative="1">
+      <w:start w:val="1"/>
+      <w:numFmt w:val="bullet"/>
+      <w:lvlText w:val=""/>
+      <w:lvlJc w:val="left"/>
+      <w:pPr>
+        <w:ind w:left="4320" w:hanging="360"/>
+      </w:pPr>
+      <w:rPr>
+        <w:rFonts w:ascii="Wingdings" w:hAnsi="Wingdings" w:hint="default"/>
+      </w:rPr>
+    </w:lvl>
+    <w:lvl w:ilvl="6" w:tplc="04090001" w:tentative="1">
+      <w:start w:val="1"/>
+      <w:numFmt w:val="bullet"/>
+      <w:lvlText w:val=""/>
+      <w:lvlJc w:val="left"/>
+      <w:pPr>
+        <w:ind w:left="5040" w:hanging="360"/>
+      </w:pPr>
+      <w:rPr>
+        <w:rFonts w:ascii="Symbol" w:hAnsi="Symbol" w:hint="default"/>
+      </w:rPr>
+    </w:lvl>
+    <w:lvl w:ilvl="7" w:tplc="04090003" w:tentative="1">
+      <w:start w:val="1"/>
+      <w:numFmt w:val="bullet"/>
+      <w:lvlText w:val="o"/>
+      <w:lvlJc w:val="left"/>
+      <w:pPr>
+        <w:ind w:left="5760" w:hanging="360"/>
+      </w:pPr>
+      <w:rPr>
+        <w:rFonts w:ascii="Courier New" w:hAnsi="Courier New" w:cs="Courier New" w:hint="default"/>
+      </w:rPr>
+    </w:lvl>
+    <w:lvl w:ilvl="8" w:tplc="04090005" w:tentative="1">
+      <w:start w:val="1"/>
+      <w:numFmt w:val="bullet"/>
+      <w:lvlText w:val=""/>
+      <w:lvlJc w:val="left"/>
+      <w:pPr>
+        <w:ind w:left="6480" w:hanging="360"/>
+      </w:pPr>
+      <w:rPr>
+        <w:rFonts w:ascii="Wingdings" w:hAnsi="Wingdings" w:hint="default"/>
+      </w:rPr>
+    </w:lvl>
+  </w:abstractNum>
+  <w:abstractNum w:abstractNumId="7" w15:restartNumberingAfterBreak="0">
     <w:nsid w:val="34585EF9"/>
     <w:multiLevelType w:val="multilevel"/>
     <w:tmpl w:val="8BDC132A"/>
@@ -7103,7 +7346,7 @@
       </w:pPr>
     </w:lvl>
   </w:abstractNum>
-  <w:abstractNum w:abstractNumId="7" w15:restartNumberingAfterBreak="0">
+  <w:abstractNum w:abstractNumId="8" w15:restartNumberingAfterBreak="0">
     <w:nsid w:val="44663781"/>
     <w:multiLevelType w:val="multilevel"/>
     <w:tmpl w:val="1298B316"/>
@@ -7189,7 +7432,7 @@
       </w:pPr>
     </w:lvl>
   </w:abstractNum>
-  <w:abstractNum w:abstractNumId="8" w15:restartNumberingAfterBreak="0">
+  <w:abstractNum w:abstractNumId="9" w15:restartNumberingAfterBreak="0">
     <w:nsid w:val="496913F7"/>
     <w:multiLevelType w:val="multilevel"/>
     <w:tmpl w:val="77F09A0C"/>
@@ -7306,7 +7549,7 @@
       </w:rPr>
     </w:lvl>
   </w:abstractNum>
-  <w:abstractNum w:abstractNumId="9" w15:restartNumberingAfterBreak="0">
+  <w:abstractNum w:abstractNumId="10" w15:restartNumberingAfterBreak="0">
     <w:nsid w:val="5421312A"/>
     <w:multiLevelType w:val="hybridMultilevel"/>
     <w:tmpl w:val="B2863D42"/>
@@ -7392,7 +7635,7 @@
       </w:pPr>
     </w:lvl>
   </w:abstractNum>
-  <w:abstractNum w:abstractNumId="10" w15:restartNumberingAfterBreak="0">
+  <w:abstractNum w:abstractNumId="11" w15:restartNumberingAfterBreak="0">
     <w:nsid w:val="5DBA77AD"/>
     <w:multiLevelType w:val="multilevel"/>
     <w:tmpl w:val="E286B46E"/>
@@ -7478,7 +7721,7 @@
       </w:pPr>
     </w:lvl>
   </w:abstractNum>
-  <w:abstractNum w:abstractNumId="11" w15:restartNumberingAfterBreak="0">
+  <w:abstractNum w:abstractNumId="12" w15:restartNumberingAfterBreak="0">
     <w:nsid w:val="61426F14"/>
     <w:multiLevelType w:val="multilevel"/>
     <w:tmpl w:val="460EF9AC"/>
@@ -7564,7 +7807,7 @@
       </w:pPr>
     </w:lvl>
   </w:abstractNum>
-  <w:abstractNum w:abstractNumId="12" w15:restartNumberingAfterBreak="0">
+  <w:abstractNum w:abstractNumId="13" w15:restartNumberingAfterBreak="0">
     <w:nsid w:val="64BD7D22"/>
     <w:multiLevelType w:val="multilevel"/>
     <w:tmpl w:val="A2369330"/>
@@ -7677,7 +7920,7 @@
       </w:rPr>
     </w:lvl>
   </w:abstractNum>
-  <w:abstractNum w:abstractNumId="13" w15:restartNumberingAfterBreak="0">
+  <w:abstractNum w:abstractNumId="14" w15:restartNumberingAfterBreak="0">
     <w:nsid w:val="68A12F61"/>
     <w:multiLevelType w:val="multilevel"/>
     <w:tmpl w:val="B4300AF2"/>
@@ -7766,7 +8009,7 @@
       </w:pPr>
     </w:lvl>
   </w:abstractNum>
-  <w:abstractNum w:abstractNumId="14" w15:restartNumberingAfterBreak="0">
+  <w:abstractNum w:abstractNumId="15" w15:restartNumberingAfterBreak="0">
     <w:nsid w:val="6A9A5970"/>
     <w:multiLevelType w:val="multilevel"/>
     <w:tmpl w:val="AC2ECB92"/>
@@ -7879,7 +8122,7 @@
       </w:rPr>
     </w:lvl>
   </w:abstractNum>
-  <w:abstractNum w:abstractNumId="15" w15:restartNumberingAfterBreak="0">
+  <w:abstractNum w:abstractNumId="16" w15:restartNumberingAfterBreak="0">
     <w:nsid w:val="71D60036"/>
     <w:multiLevelType w:val="multilevel"/>
     <w:tmpl w:val="7F5C79A0"/>
@@ -7965,7 +8208,7 @@
       </w:pPr>
     </w:lvl>
   </w:abstractNum>
-  <w:abstractNum w:abstractNumId="16" w15:restartNumberingAfterBreak="0">
+  <w:abstractNum w:abstractNumId="17" w15:restartNumberingAfterBreak="0">
     <w:nsid w:val="75E23EFF"/>
     <w:multiLevelType w:val="multilevel"/>
     <w:tmpl w:val="F2229BD0"/>
@@ -8095,7 +8338,7 @@
       </w:rPr>
     </w:lvl>
   </w:abstractNum>
-  <w:abstractNum w:abstractNumId="17" w15:restartNumberingAfterBreak="0">
+  <w:abstractNum w:abstractNumId="18" w15:restartNumberingAfterBreak="0">
     <w:nsid w:val="7B5D796B"/>
     <w:multiLevelType w:val="multilevel"/>
     <w:tmpl w:val="F3B63924"/>
@@ -8211,40 +8454,40 @@
     </w:lvl>
   </w:abstractNum>
   <w:num w:numId="1" w16cid:durableId="296374662">
-    <w:abstractNumId w:val="6"/>
+    <w:abstractNumId w:val="7"/>
   </w:num>
   <w:num w:numId="2" w16cid:durableId="655957171">
-    <w:abstractNumId w:val="12"/>
+    <w:abstractNumId w:val="13"/>
   </w:num>
   <w:num w:numId="3" w16cid:durableId="1396275303">
-    <w:abstractNumId w:val="13"/>
+    <w:abstractNumId w:val="14"/>
   </w:num>
   <w:num w:numId="4" w16cid:durableId="1797945957">
     <w:abstractNumId w:val="4"/>
   </w:num>
   <w:num w:numId="5" w16cid:durableId="1118186817">
+    <w:abstractNumId w:val="17"/>
+  </w:num>
+  <w:num w:numId="6" w16cid:durableId="189150980">
     <w:abstractNumId w:val="16"/>
   </w:num>
-  <w:num w:numId="6" w16cid:durableId="189150980">
+  <w:num w:numId="7" w16cid:durableId="1807972708">
     <w:abstractNumId w:val="15"/>
   </w:num>
-  <w:num w:numId="7" w16cid:durableId="1807972708">
-    <w:abstractNumId w:val="14"/>
-  </w:num>
   <w:num w:numId="8" w16cid:durableId="1748721265">
-    <w:abstractNumId w:val="7"/>
+    <w:abstractNumId w:val="8"/>
   </w:num>
   <w:num w:numId="9" w16cid:durableId="1413087384">
-    <w:abstractNumId w:val="10"/>
+    <w:abstractNumId w:val="11"/>
   </w:num>
   <w:num w:numId="10" w16cid:durableId="837501196">
-    <w:abstractNumId w:val="11"/>
+    <w:abstractNumId w:val="12"/>
   </w:num>
   <w:num w:numId="11" w16cid:durableId="1325888420">
-    <w:abstractNumId w:val="17"/>
+    <w:abstractNumId w:val="18"/>
   </w:num>
   <w:num w:numId="12" w16cid:durableId="655451055">
-    <w:abstractNumId w:val="8"/>
+    <w:abstractNumId w:val="9"/>
   </w:num>
   <w:num w:numId="13" w16cid:durableId="1783769999">
     <w:abstractNumId w:val="3"/>
@@ -8256,13 +8499,16 @@
     <w:abstractNumId w:val="5"/>
   </w:num>
   <w:num w:numId="16" w16cid:durableId="1939021247">
-    <w:abstractNumId w:val="9"/>
+    <w:abstractNumId w:val="10"/>
   </w:num>
   <w:num w:numId="17" w16cid:durableId="677150304">
     <w:abstractNumId w:val="0"/>
   </w:num>
   <w:num w:numId="18" w16cid:durableId="437068534">
     <w:abstractNumId w:val="1"/>
+  </w:num>
+  <w:num w:numId="19" w16cid:durableId="1189952953">
+    <w:abstractNumId w:val="6"/>
   </w:num>
 </w:numbering>
 </file>

</xml_diff>